<commit_message>
Update onboarding docs for client-filmed content and call-and-book service
Co-Authored-By: Claude Sonnet 5.5 <noreply@anthropic.com>
</commit_message>
<xml_diff>
--- a/onboarding/DentaScale-Account-Access-Guide.docx
+++ b/onboarding/DentaScale-Account-Access-Guide.docx
@@ -576,7 +576,7 @@
           <w:sz w:val="26"/>
           <w:szCs w:val="26"/>
         </w:rPr>
-        <w:t xml:space="preserve">6. Where leads should go</w:t>
+        <w:t xml:space="preserve">6. Where leads go, and your consultation calendar</w:t>
       </w:r>
     </w:p>
     <w:p>
@@ -590,7 +590,7 @@
           <w:sz w:val="21"/>
           <w:szCs w:val="21"/>
         </w:rPr>
-        <w:t xml:space="preserve">Tell us where you want new leads delivered so nothing sits unseen:</w:t>
+        <w:t xml:space="preserve">We call every lead and book them into your calendar, so we need to see it. Share your scheduling software with us, or tell us how you prefer to handle it:</w:t>
       </w:r>
     </w:p>
     <w:p>
@@ -650,7 +650,7 @@
           <w:sz w:val="21"/>
           <w:szCs w:val="21"/>
         </w:rPr>
-        <w:t xml:space="preserve">Practice management or CRM software you use:  </w:t>
+        <w:t xml:space="preserve">Scheduling or calendar software (we will book consults into it):  </w:t>
       </w:r>
       <w:r>
         <w:rPr>

</xml_diff>